<commit_message>
docs: Se añadieron documentos para complementar el modulo 1
</commit_message>
<xml_diff>
--- a/process/psp1-calidad-procesos/Modulo2/Documento Descripción del problema2.docx
+++ b/process/psp1-calidad-procesos/Modulo2/Documento Descripción del problema2.docx
@@ -11332,14 +11332,573 @@
         <w:t>La implementación de estas prácticas facilitará el registro métrico dentro del flujo de PSP, mejorando el control del tiempo invertido y reduciendo la densidad de defectos en las fases de compilación y pruebas.</w:t>
       </w:r>
     </w:p>
+    <w:p>
+      <w:pPr>
+        <w:spacing w:after="0" w:line="240" w:lineRule="auto"/>
+        <w:rPr>
+          <w:color w:val="000000" w:themeColor="text1"/>
+        </w:rPr>
+      </w:pPr>
+    </w:p>
+    <w:p>
+      <w:pPr>
+        <w:spacing w:after="0" w:line="240" w:lineRule="auto"/>
+        <w:rPr>
+          <w:color w:val="000000" w:themeColor="text1"/>
+        </w:rPr>
+      </w:pPr>
+    </w:p>
+    <w:p>
+      <w:pPr>
+        <w:spacing w:after="0" w:line="240" w:lineRule="auto"/>
+        <w:rPr>
+          <w:color w:val="000000" w:themeColor="text1"/>
+        </w:rPr>
+      </w:pPr>
+    </w:p>
+    <w:p>
+      <w:pPr>
+        <w:spacing w:after="0" w:line="240" w:lineRule="auto"/>
+        <w:rPr>
+          <w:color w:val="000000" w:themeColor="text1"/>
+        </w:rPr>
+      </w:pPr>
+    </w:p>
+    <w:p>
+      <w:pPr>
+        <w:pStyle w:val="Ttulo2"/>
+        <w:rPr>
+          <w:rFonts w:ascii="Aptos Display" w:hAnsi="Aptos Display"/>
+          <w:b/>
+          <w:bCs/>
+          <w:color w:val="387EB9"/>
+          <w:sz w:val="40"/>
+          <w:szCs w:val="40"/>
+        </w:rPr>
+      </w:pPr>
+      <w:r>
+        <w:rPr>
+          <w:rFonts w:asciiTheme="minorHAnsi" w:eastAsiaTheme="minorEastAsia" w:hAnsiTheme="minorHAnsi" w:cstheme="minorBidi"/>
+          <w:color w:val="auto"/>
+          <w:sz w:val="22"/>
+          <w:szCs w:val="22"/>
+        </w:rPr>
+        <w:lastRenderedPageBreak/>
+        <w:t xml:space="preserve"> </w:t>
+      </w:r>
+      <w:r>
+        <w:rPr>
+          <w:rFonts w:ascii="Aptos Display" w:hAnsi="Aptos Display"/>
+          <w:b/>
+          <w:bCs/>
+          <w:color w:val="387EB9"/>
+          <w:sz w:val="40"/>
+          <w:szCs w:val="40"/>
+        </w:rPr>
+        <w:t xml:space="preserve">Valoración de la herramienta </w:t>
+      </w:r>
+      <w:proofErr w:type="spellStart"/>
+      <w:r>
+        <w:rPr>
+          <w:rFonts w:ascii="Aptos Display" w:hAnsi="Aptos Display"/>
+          <w:b/>
+          <w:bCs/>
+          <w:color w:val="387EB9"/>
+          <w:sz w:val="40"/>
+          <w:szCs w:val="40"/>
+        </w:rPr>
+        <w:t>Checkstyle</w:t>
+      </w:r>
+      <w:proofErr w:type="spellEnd"/>
+    </w:p>
+    <w:p>
+      <w:pPr>
+        <w:spacing w:after="0" w:line="240" w:lineRule="auto"/>
+        <w:rPr>
+          <w:rFonts w:ascii="Aptos Display" w:hAnsi="Aptos Display"/>
+        </w:rPr>
+      </w:pPr>
+      <w:r>
+        <w:rPr>
+          <w:rFonts w:ascii="Aptos Display" w:hAnsi="Aptos Display"/>
+        </w:rPr>
+        <w:t xml:space="preserve">Mi manera de usar el </w:t>
+      </w:r>
+      <w:proofErr w:type="spellStart"/>
+      <w:r>
+        <w:rPr>
+          <w:rFonts w:ascii="Aptos Display" w:hAnsi="Aptos Display"/>
+        </w:rPr>
+        <w:t>checkstyle</w:t>
+      </w:r>
+      <w:proofErr w:type="spellEnd"/>
+      <w:r>
+        <w:rPr>
+          <w:rFonts w:ascii="Aptos Display" w:hAnsi="Aptos Display"/>
+        </w:rPr>
+        <w:t xml:space="preserve"> fue agregando el plugin a mi paquete </w:t>
+      </w:r>
+      <w:proofErr w:type="spellStart"/>
+      <w:r>
+        <w:rPr>
+          <w:rFonts w:ascii="Aptos Display" w:hAnsi="Aptos Display"/>
+        </w:rPr>
+        <w:t>Netbeans</w:t>
+      </w:r>
+      <w:proofErr w:type="spellEnd"/>
+    </w:p>
+    <w:p>
+      <w:pPr>
+        <w:spacing w:after="0" w:line="240" w:lineRule="auto"/>
+        <w:rPr>
+          <w:rFonts w:ascii="Aptos Display" w:hAnsi="Aptos Display"/>
+        </w:rPr>
+      </w:pPr>
+      <w:r>
+        <w:rPr>
+          <w:rFonts w:ascii="Aptos Display" w:hAnsi="Aptos Display"/>
+        </w:rPr>
+        <w:t>Y los archivos que examine fueron los siguientes:</w:t>
+      </w:r>
+    </w:p>
+    <w:p>
+      <w:pPr>
+        <w:spacing w:after="0" w:line="240" w:lineRule="auto"/>
+        <w:rPr>
+          <w:rFonts w:ascii="Aptos Display" w:hAnsi="Aptos Display"/>
+        </w:rPr>
+      </w:pPr>
+    </w:p>
+    <w:p>
+      <w:pPr>
+        <w:spacing w:after="0" w:line="240" w:lineRule="auto"/>
+        <w:rPr>
+          <w:rFonts w:ascii="Aptos Display" w:hAnsi="Aptos Display"/>
+        </w:rPr>
+      </w:pPr>
+      <w:proofErr w:type="spellStart"/>
+      <w:proofErr w:type="gramStart"/>
+      <w:r>
+        <w:rPr>
+          <w:rFonts w:ascii="Aptos Display" w:hAnsi="Aptos Display"/>
+        </w:rPr>
+        <w:t>checkstyle:check</w:t>
+      </w:r>
+      <w:proofErr w:type="spellEnd"/>
+      <w:proofErr w:type="gramEnd"/>
+      <w:r>
+        <w:rPr>
+          <w:rFonts w:ascii="Aptos Display" w:hAnsi="Aptos Display"/>
+        </w:rPr>
+        <w:t xml:space="preserve"> -Dcheckstyle.source.dir=src/main/java/interfaz/mobimedline_sistema/</w:t>
+      </w:r>
+      <w:proofErr w:type="gramStart"/>
+      <w:r>
+        <w:rPr>
+          <w:rFonts w:ascii="Aptos Display" w:hAnsi="Aptos Display"/>
+        </w:rPr>
+        <w:t>controllers,src</w:t>
+      </w:r>
+      <w:proofErr w:type="gramEnd"/>
+      <w:r>
+        <w:rPr>
+          <w:rFonts w:ascii="Aptos Display" w:hAnsi="Aptos Display"/>
+        </w:rPr>
+        <w:t>/main/java/interfaz/mobimedline_sistema/service</w:t>
+      </w:r>
+    </w:p>
     <w:p/>
     <w:p>
       <w:pPr>
         <w:spacing w:after="0" w:line="240" w:lineRule="auto"/>
-      </w:pPr>
+        <w:rPr>
+          <w:color w:val="000000" w:themeColor="text1"/>
+        </w:rPr>
+      </w:pPr>
+      <w:r>
+        <w:rPr>
+          <w:color w:val="000000" w:themeColor="text1"/>
+        </w:rPr>
+        <w:drawing>
+          <wp:inline distT="0" distB="0" distL="0" distR="0" wp14:anchorId="4BAA25DA" wp14:editId="5989B35B">
+            <wp:extent cx="5400040" cy="2496820"/>
+            <wp:effectExtent l="0" t="0" r="0" b="0"/>
+            <wp:docPr id="982421628" name="Imagen 1"/>
+            <wp:cNvGraphicFramePr>
+              <a:graphicFrameLocks xmlns:a="http://schemas.openxmlformats.org/drawingml/2006/main" noChangeAspect="1"/>
+            </wp:cNvGraphicFramePr>
+            <a:graphic xmlns:a="http://schemas.openxmlformats.org/drawingml/2006/main">
+              <a:graphicData uri="http://schemas.openxmlformats.org/drawingml/2006/picture">
+                <pic:pic xmlns:pic="http://schemas.openxmlformats.org/drawingml/2006/picture">
+                  <pic:nvPicPr>
+                    <pic:cNvPr id="982421628" name=""/>
+                    <pic:cNvPicPr/>
+                  </pic:nvPicPr>
+                  <pic:blipFill>
+                    <a:blip r:embed="rId28"/>
+                    <a:stretch>
+                      <a:fillRect/>
+                    </a:stretch>
+                  </pic:blipFill>
+                  <pic:spPr>
+                    <a:xfrm>
+                      <a:off x="0" y="0"/>
+                      <a:ext cx="5400040" cy="2496820"/>
+                    </a:xfrm>
+                    <a:prstGeom prst="rect">
+                      <a:avLst/>
+                    </a:prstGeom>
+                  </pic:spPr>
+                </pic:pic>
+              </a:graphicData>
+            </a:graphic>
+          </wp:inline>
+        </w:drawing>
+      </w:r>
+    </w:p>
+    <w:p>
+      <w:pPr>
+        <w:spacing w:after="0" w:line="240" w:lineRule="auto"/>
+      </w:pPr>
+    </w:p>
+    <w:p>
+      <w:pPr>
+        <w:spacing w:after="0" w:line="240" w:lineRule="auto"/>
+      </w:pPr>
+    </w:p>
+    <w:p>
+      <w:pPr>
+        <w:spacing w:after="0" w:line="240" w:lineRule="auto"/>
+      </w:pPr>
+    </w:p>
+    <w:p>
+      <w:pPr>
+        <w:spacing w:after="0" w:line="240" w:lineRule="auto"/>
+      </w:pPr>
+    </w:p>
+    <w:p>
+      <w:pPr>
+        <w:spacing w:after="0" w:line="240" w:lineRule="auto"/>
+      </w:pPr>
+    </w:p>
+    <w:p>
+      <w:pPr>
+        <w:spacing w:after="0" w:line="240" w:lineRule="auto"/>
+      </w:pPr>
+    </w:p>
+    <w:p>
+      <w:pPr>
+        <w:spacing w:after="0" w:line="240" w:lineRule="auto"/>
+      </w:pPr>
+    </w:p>
+    <w:p>
+      <w:pPr>
+        <w:spacing w:after="0" w:line="240" w:lineRule="auto"/>
+      </w:pPr>
+    </w:p>
+    <w:p>
+      <w:pPr>
+        <w:spacing w:after="0" w:line="240" w:lineRule="auto"/>
+      </w:pPr>
+    </w:p>
+    <w:p>
+      <w:pPr>
+        <w:spacing w:after="0" w:line="240" w:lineRule="auto"/>
+      </w:pPr>
+    </w:p>
+    <w:p>
+      <w:pPr>
+        <w:spacing w:after="0" w:line="240" w:lineRule="auto"/>
+      </w:pPr>
+    </w:p>
+    <w:p>
+      <w:pPr>
+        <w:spacing w:after="0" w:line="240" w:lineRule="auto"/>
+      </w:pPr>
+    </w:p>
+    <w:p>
+      <w:pPr>
+        <w:spacing w:after="0" w:line="240" w:lineRule="auto"/>
+      </w:pPr>
+    </w:p>
+    <w:p>
+      <w:pPr>
+        <w:spacing w:after="0" w:line="240" w:lineRule="auto"/>
+      </w:pPr>
+    </w:p>
+    <w:p>
+      <w:pPr>
+        <w:spacing w:after="0" w:line="240" w:lineRule="auto"/>
+      </w:pPr>
+    </w:p>
+    <w:p>
+      <w:pPr>
+        <w:spacing w:after="0" w:line="240" w:lineRule="auto"/>
+      </w:pPr>
+    </w:p>
+    <w:p>
+      <w:pPr>
+        <w:spacing w:after="0" w:line="240" w:lineRule="auto"/>
+      </w:pPr>
+    </w:p>
+    <w:p>
+      <w:pPr>
+        <w:spacing w:after="0" w:line="240" w:lineRule="auto"/>
+      </w:pPr>
+    </w:p>
+    <w:p>
+      <w:pPr>
+        <w:spacing w:after="0" w:line="240" w:lineRule="auto"/>
+      </w:pPr>
+    </w:p>
+    <w:p>
+      <w:pPr>
+        <w:spacing w:after="0" w:line="240" w:lineRule="auto"/>
+      </w:pPr>
+    </w:p>
+    <w:p>
+      <w:pPr>
+        <w:spacing w:after="0" w:line="240" w:lineRule="auto"/>
+      </w:pPr>
+    </w:p>
+    <w:p>
+      <w:pPr>
+        <w:spacing w:after="0" w:line="240" w:lineRule="auto"/>
+      </w:pPr>
+    </w:p>
+    <w:p>
+      <w:pPr>
+        <w:spacing w:after="0" w:line="240" w:lineRule="auto"/>
+      </w:pPr>
+    </w:p>
+    <w:p>
+      <w:pPr>
+        <w:spacing w:after="0" w:line="240" w:lineRule="auto"/>
+      </w:pPr>
+    </w:p>
+    <w:p>
+      <w:pPr>
+        <w:spacing w:after="0" w:line="240" w:lineRule="auto"/>
+      </w:pPr>
+    </w:p>
+    <w:p>
+      <w:pPr>
+        <w:spacing w:after="0" w:line="240" w:lineRule="auto"/>
+      </w:pPr>
+    </w:p>
+    <w:p>
+      <w:pPr>
+        <w:pStyle w:val="Ttulo2"/>
+        <w:rPr>
+          <w:rFonts w:ascii="Aptos Display" w:hAnsi="Aptos Display"/>
+          <w:b/>
+          <w:bCs/>
+          <w:color w:val="387EB9"/>
+          <w:sz w:val="40"/>
+          <w:szCs w:val="40"/>
+          <w:u w:val="single"/>
+        </w:rPr>
+      </w:pPr>
+      <w:r>
+        <w:rPr>
+          <w:rFonts w:ascii="Aptos Display" w:hAnsi="Aptos Display"/>
+          <w:b/>
+          <w:bCs/>
+          <w:color w:val="387EB9"/>
+          <w:sz w:val="40"/>
+          <w:szCs w:val="40"/>
+        </w:rPr>
+        <w:lastRenderedPageBreak/>
+        <w:t>Evidencias del proceso</w:t>
+      </w:r>
+    </w:p>
+    <w:p>
+      <w:pPr>
+        <w:spacing w:after="0" w:line="240" w:lineRule="auto"/>
+      </w:pPr>
+    </w:p>
+    <w:p>
+      <w:pPr>
+        <w:spacing w:after="0" w:line="240" w:lineRule="auto"/>
+      </w:pPr>
+      <w:r>
+        <w:t>Evidencia de SSH:</w:t>
+      </w:r>
+    </w:p>
+    <w:p>
+      <w:pPr>
+        <w:spacing w:after="0" w:line="240" w:lineRule="auto"/>
+      </w:pPr>
+      <w:r>
+        <w:drawing>
+          <wp:inline distT="0" distB="0" distL="0" distR="0" wp14:anchorId="4A06E4D2" wp14:editId="3CD57652">
+            <wp:extent cx="5400040" cy="5334635"/>
+            <wp:effectExtent l="0" t="0" r="0" b="0"/>
+            <wp:docPr id="2116024261" name="Imagen 1"/>
+            <wp:cNvGraphicFramePr>
+              <a:graphicFrameLocks xmlns:a="http://schemas.openxmlformats.org/drawingml/2006/main" noChangeAspect="1"/>
+            </wp:cNvGraphicFramePr>
+            <a:graphic xmlns:a="http://schemas.openxmlformats.org/drawingml/2006/main">
+              <a:graphicData uri="http://schemas.openxmlformats.org/drawingml/2006/picture">
+                <pic:pic xmlns:pic="http://schemas.openxmlformats.org/drawingml/2006/picture">
+                  <pic:nvPicPr>
+                    <pic:cNvPr id="2116024261" name=""/>
+                    <pic:cNvPicPr/>
+                  </pic:nvPicPr>
+                  <pic:blipFill>
+                    <a:blip r:embed="rId29"/>
+                    <a:stretch>
+                      <a:fillRect/>
+                    </a:stretch>
+                  </pic:blipFill>
+                  <pic:spPr>
+                    <a:xfrm>
+                      <a:off x="0" y="0"/>
+                      <a:ext cx="5400040" cy="5334635"/>
+                    </a:xfrm>
+                    <a:prstGeom prst="rect">
+                      <a:avLst/>
+                    </a:prstGeom>
+                  </pic:spPr>
+                </pic:pic>
+              </a:graphicData>
+            </a:graphic>
+          </wp:inline>
+        </w:drawing>
+      </w:r>
+    </w:p>
+    <w:p>
+      <w:pPr>
+        <w:tabs>
+          <w:tab w:val="left" w:pos="889"/>
+        </w:tabs>
+      </w:pPr>
+      <w:r>
+        <w:tab/>
+      </w:r>
+    </w:p>
+    <w:p>
+      <w:pPr>
+        <w:tabs>
+          <w:tab w:val="left" w:pos="889"/>
+        </w:tabs>
+      </w:pPr>
+    </w:p>
+    <w:p>
+      <w:pPr>
+        <w:tabs>
+          <w:tab w:val="left" w:pos="889"/>
+        </w:tabs>
+      </w:pPr>
+    </w:p>
+    <w:p>
+      <w:pPr>
+        <w:tabs>
+          <w:tab w:val="left" w:pos="889"/>
+        </w:tabs>
+      </w:pPr>
+    </w:p>
+    <w:p>
+      <w:pPr>
+        <w:tabs>
+          <w:tab w:val="left" w:pos="889"/>
+        </w:tabs>
+      </w:pPr>
+    </w:p>
+    <w:p>
+      <w:pPr>
+        <w:tabs>
+          <w:tab w:val="left" w:pos="889"/>
+        </w:tabs>
+      </w:pPr>
+    </w:p>
+    <w:p>
+      <w:pPr>
+        <w:tabs>
+          <w:tab w:val="left" w:pos="889"/>
+        </w:tabs>
+      </w:pPr>
+    </w:p>
+    <w:p>
+      <w:pPr>
+        <w:tabs>
+          <w:tab w:val="left" w:pos="889"/>
+        </w:tabs>
+      </w:pPr>
+    </w:p>
+    <w:p>
+      <w:pPr>
+        <w:tabs>
+          <w:tab w:val="left" w:pos="889"/>
+        </w:tabs>
+      </w:pPr>
+    </w:p>
+    <w:p>
+      <w:pPr>
+        <w:tabs>
+          <w:tab w:val="left" w:pos="889"/>
+        </w:tabs>
+      </w:pPr>
+    </w:p>
+    <w:p>
+      <w:pPr>
+        <w:tabs>
+          <w:tab w:val="left" w:pos="889"/>
+        </w:tabs>
+      </w:pPr>
+      <w:r>
+        <w:t xml:space="preserve">Evidencia de </w:t>
+      </w:r>
+      <w:r>
+        <w:t>manejo de ramas:</w:t>
+      </w:r>
+    </w:p>
+    <w:p>
+      <w:pPr>
+        <w:tabs>
+          <w:tab w:val="left" w:pos="889"/>
+        </w:tabs>
+      </w:pPr>
+      <w:r>
+        <w:drawing>
+          <wp:inline distT="0" distB="0" distL="0" distR="0" wp14:anchorId="6C01E56D" wp14:editId="0BAA0AEC">
+            <wp:extent cx="5400040" cy="3004185"/>
+            <wp:effectExtent l="0" t="0" r="0" b="5715"/>
+            <wp:docPr id="385992154" name="Imagen 1"/>
+            <wp:cNvGraphicFramePr>
+              <a:graphicFrameLocks xmlns:a="http://schemas.openxmlformats.org/drawingml/2006/main" noChangeAspect="1"/>
+            </wp:cNvGraphicFramePr>
+            <a:graphic xmlns:a="http://schemas.openxmlformats.org/drawingml/2006/main">
+              <a:graphicData uri="http://schemas.openxmlformats.org/drawingml/2006/picture">
+                <pic:pic xmlns:pic="http://schemas.openxmlformats.org/drawingml/2006/picture">
+                  <pic:nvPicPr>
+                    <pic:cNvPr id="385992154" name=""/>
+                    <pic:cNvPicPr/>
+                  </pic:nvPicPr>
+                  <pic:blipFill>
+                    <a:blip r:embed="rId30"/>
+                    <a:stretch>
+                      <a:fillRect/>
+                    </a:stretch>
+                  </pic:blipFill>
+                  <pic:spPr>
+                    <a:xfrm>
+                      <a:off x="0" y="0"/>
+                      <a:ext cx="5400040" cy="3004185"/>
+                    </a:xfrm>
+                    <a:prstGeom prst="rect">
+                      <a:avLst/>
+                    </a:prstGeom>
+                  </pic:spPr>
+                </pic:pic>
+              </a:graphicData>
+            </a:graphic>
+          </wp:inline>
+        </w:drawing>
+      </w:r>
     </w:p>
     <w:sectPr>
-      <w:footerReference w:type="default" r:id="rId28"/>
+      <w:footerReference w:type="default" r:id="rId31"/>
       <w:pgSz w:w="11906" w:h="16838"/>
       <w:pgMar w:top="1417" w:right="1701" w:bottom="1417" w:left="1701" w:header="708" w:footer="708" w:gutter="0"/>
       <w:pgNumType w:start="1"/>

</xml_diff>